<commit_message>
docs: GitHub link, refreshed screenshots and project document
Co-Authored-By: Claude Sonnet 5.5 <noreply@anthropic.com>
</commit_message>
<xml_diff>
--- a/docs/Gender_Neutral_Language_Recognizer_Project_Document.docx
+++ b/docs/Gender_Neutral_Language_Recognizer_Project_Document.docx
@@ -248,12 +248,20 @@
           <w:rFonts w:ascii="Arial" w:hAnsi="Arial" w:cs="Arial"/>
         </w:rPr>
       </w:pPr>
+      <w:proofErr w:type="gramStart"/>
       <w:r>
         <w:rPr>
           <w:rFonts w:ascii="Arial" w:hAnsi="Arial" w:cs="Arial"/>
         </w:rPr>
         <w:lastRenderedPageBreak/>
-        <w:t>1  Project overview</w:t>
+        <w:t>1  Project</w:t>
+      </w:r>
+      <w:proofErr w:type="gramEnd"/>
+      <w:r>
+        <w:rPr>
+          <w:rFonts w:ascii="Arial" w:hAnsi="Arial" w:cs="Arial"/>
+        </w:rPr>
+        <w:t xml:space="preserve"> overview</w:t>
       </w:r>
     </w:p>
     <w:p>
@@ -276,11 +284,19 @@
           <w:rFonts w:ascii="Arial" w:hAnsi="Arial" w:cs="Arial"/>
         </w:rPr>
       </w:pPr>
+      <w:proofErr w:type="gramStart"/>
       <w:r>
         <w:rPr>
           <w:rFonts w:ascii="Arial" w:hAnsi="Arial" w:cs="Arial"/>
         </w:rPr>
-        <w:t>2  Tools and recognition approach</w:t>
+        <w:t>2  Tools</w:t>
+      </w:r>
+      <w:proofErr w:type="gramEnd"/>
+      <w:r>
+        <w:rPr>
+          <w:rFonts w:ascii="Arial" w:hAnsi="Arial" w:cs="Arial"/>
+        </w:rPr>
+        <w:t xml:space="preserve"> and recognition approach</w:t>
       </w:r>
     </w:p>
     <w:p>
@@ -2850,11 +2866,19 @@
           <w:rFonts w:ascii="Arial" w:hAnsi="Arial" w:cs="Arial"/>
         </w:rPr>
       </w:pPr>
+      <w:proofErr w:type="gramStart"/>
       <w:r>
         <w:rPr>
           <w:rFonts w:ascii="Arial" w:hAnsi="Arial" w:cs="Arial"/>
         </w:rPr>
-        <w:t>3  Application screenshots</w:t>
+        <w:t>3  Application</w:t>
+      </w:r>
+      <w:proofErr w:type="gramEnd"/>
+      <w:r>
+        <w:rPr>
+          <w:rFonts w:ascii="Arial" w:hAnsi="Arial" w:cs="Arial"/>
+        </w:rPr>
+        <w:t xml:space="preserve"> screenshots</w:t>
       </w:r>
     </w:p>
     <w:p>
@@ -2900,14 +2924,18 @@
           <w:b/>
           <w:bCs/>
         </w:rPr>
-        <w:t xml:space="preserve">Source code (GitHub): </w:t>
+        <w:t xml:space="preserve">Source code (GitHub, public): </w:t>
       </w:r>
-      <w:r>
-        <w:rPr>
-          <w:rFonts w:ascii="Arial" w:hAnsi="Arial" w:cs="Arial"/>
-        </w:rPr>
-        <w:t xml:space="preserve">[insert the public GitHub repository link here]</w:t>
-      </w:r>
+      <w:hyperlink r:id="rId104">
+        <w:r>
+          <w:rPr>
+            <w:rFonts w:ascii="Arial" w:hAnsi="Arial" w:cs="Arial"/>
+            <w:color w:val="0563C1"/>
+            <w:u w:val="single"/>
+          </w:rPr>
+          <w:t>https://github.com/dewdew-del/gender-neutral-recognizer</w:t>
+        </w:r>
+      </w:hyperlink>
     </w:p>
     <w:p>
       <w:pPr>
@@ -2931,7 +2959,7 @@
                     <pic:cNvPicPr/>
                   </pic:nvPicPr>
                   <pic:blipFill>
-                    <a:blip r:embed="rId104"/>
+                    <a:blip r:embed="rId105"/>
                     <a:stretch>
                       <a:fillRect/>
                     </a:stretch>
@@ -2980,7 +3008,7 @@
       <w:r>
         <w:drawing>
           <wp:inline distT="0" distB="0" distL="0" distR="0">
-            <wp:extent cx="3291840" cy="5257966"/>
+            <wp:extent cx="4023360" cy="6697066"/>
             <wp:docPr id="504" name="2-results-counts.png" descr="2-results-counts.png"/>
             <wp:cNvGraphicFramePr>
               <a:graphicFrameLocks xmlns:a="http://schemas.openxmlformats.org/drawingml/2006/main" noChangeAspect="1"/>
@@ -2993,7 +3021,7 @@
                     <pic:cNvPicPr/>
                   </pic:nvPicPr>
                   <pic:blipFill>
-                    <a:blip r:embed="rId105"/>
+                    <a:blip r:embed="rId106"/>
                     <a:stretch>
                       <a:fillRect/>
                     </a:stretch>
@@ -3001,7 +3029,7 @@
                   <pic:spPr>
                     <a:xfrm>
                       <a:off x="0" y="0"/>
-                      <a:ext cx="3291840" cy="5257966"/>
+                      <a:ext cx="4023360" cy="6697066"/>
                     </a:xfrm>
                     <a:prstGeom prst="rect">
                       <a:avLst/>
@@ -3042,7 +3070,7 @@
       <w:r>
         <w:drawing>
           <wp:inline distT="0" distB="0" distL="0" distR="0">
-            <wp:extent cx="4206240" cy="4298013"/>
+            <wp:extent cx="4206240" cy="4068581"/>
             <wp:docPr id="505" name="4-no-terms.png" descr="4-no-terms.png"/>
             <wp:cNvGraphicFramePr>
               <a:graphicFrameLocks xmlns:a="http://schemas.openxmlformats.org/drawingml/2006/main" noChangeAspect="1"/>
@@ -3055,7 +3083,7 @@
                     <pic:cNvPicPr/>
                   </pic:nvPicPr>
                   <pic:blipFill>
-                    <a:blip r:embed="rId106"/>
+                    <a:blip r:embed="rId107"/>
                     <a:stretch>
                       <a:fillRect/>
                     </a:stretch>
@@ -3063,7 +3091,7 @@
                   <pic:spPr>
                     <a:xfrm>
                       <a:off x="0" y="0"/>
-                      <a:ext cx="4206240" cy="4298013"/>
+                      <a:ext cx="4206240" cy="4068581"/>
                     </a:xfrm>
                     <a:prstGeom prst="rect">
                       <a:avLst/>
@@ -3104,7 +3132,7 @@
       <w:r>
         <w:drawing>
           <wp:inline distT="0" distB="0" distL="0" distR="0">
-            <wp:extent cx="4206240" cy="3059084"/>
+            <wp:extent cx="4754880" cy="2087142"/>
             <wp:docPr id="506" name="9-automaton-panel.png" descr="9-automaton-panel.png"/>
             <wp:cNvGraphicFramePr>
               <a:graphicFrameLocks xmlns:a="http://schemas.openxmlformats.org/drawingml/2006/main" noChangeAspect="1"/>
@@ -3117,7 +3145,7 @@
                     <pic:cNvPicPr/>
                   </pic:nvPicPr>
                   <pic:blipFill>
-                    <a:blip r:embed="rId107"/>
+                    <a:blip r:embed="rId108"/>
                     <a:stretch>
                       <a:fillRect/>
                     </a:stretch>
@@ -3125,7 +3153,7 @@
                   <pic:spPr>
                     <a:xfrm>
                       <a:off x="0" y="0"/>
-                      <a:ext cx="4206240" cy="3059084"/>
+                      <a:ext cx="4754880" cy="2087142"/>
                     </a:xfrm>
                     <a:prstGeom prst="rect">
                       <a:avLst/>
@@ -3154,7 +3182,69 @@
           <w:sz w:val="18"/>
           <w:szCs w:val="18"/>
         </w:rPr>
-        <w:t xml:space="preserve">Figure 6. The "How it works" panel with the trace of "fireman" and the transition table.</w:t>
+        <w:t xml:space="preserve">Figure 6. "The automaton behind it": how the machine processed the uploaded document (words checked, accepted terms, and rejected near misses).</w:t>
+      </w:r>
+    </w:p>
+    <w:p>
+      <w:pPr>
+        <w:keepNext/>
+        <w:jc w:val="center"/>
+        <w:spacing w:before="120" w:after="0"/>
+      </w:pPr>
+      <w:r>
+        <w:drawing>
+          <wp:inline distT="0" distB="0" distL="0" distR="0">
+            <wp:extent cx="4754880" cy="2575974"/>
+            <wp:docPr id="507" name="10-automaton-path.png" descr="10-automaton-path.png"/>
+            <wp:cNvGraphicFramePr>
+              <a:graphicFrameLocks xmlns:a="http://schemas.openxmlformats.org/drawingml/2006/main" noChangeAspect="1"/>
+            </wp:cNvGraphicFramePr>
+            <a:graphic xmlns:a="http://schemas.openxmlformats.org/drawingml/2006/main">
+              <a:graphicData uri="http://schemas.openxmlformats.org/drawingml/2006/picture">
+                <pic:pic xmlns:pic="http://schemas.openxmlformats.org/drawingml/2006/picture">
+                  <pic:nvPicPr>
+                    <pic:cNvPr id="507" name="10-automaton-path.png"/>
+                    <pic:cNvPicPr/>
+                  </pic:nvPicPr>
+                  <pic:blipFill>
+                    <a:blip r:embed="rId109"/>
+                    <a:stretch>
+                      <a:fillRect/>
+                    </a:stretch>
+                  </pic:blipFill>
+                  <pic:spPr>
+                    <a:xfrm>
+                      <a:off x="0" y="0"/>
+                      <a:ext cx="4754880" cy="2575974"/>
+                    </a:xfrm>
+                    <a:prstGeom prst="rect">
+                      <a:avLst/>
+                    </a:prstGeom>
+                  </pic:spPr>
+                </pic:pic>
+              </a:graphicData>
+            </a:graphic>
+          </wp:inline>
+        </w:drawing>
+      </w:r>
+    </w:p>
+    <w:p>
+      <w:pPr>
+        <w:jc w:val="center"/>
+        <w:spacing w:before="40" w:after="200"/>
+        <w:rPr>
+          <w:rFonts w:ascii="Arial" w:hAnsi="Arial" w:cs="Arial"/>
+        </w:rPr>
+      </w:pPr>
+      <w:r>
+        <w:rPr>
+          <w:rFonts w:ascii="Arial" w:hAnsi="Arial" w:cs="Arial"/>
+          <w:i/>
+          <w:iCs/>
+          <w:sz w:val="18"/>
+          <w:szCs w:val="18"/>
+        </w:rPr>
+        <w:t xml:space="preserve">Figure 7. The path of one word through the automaton, state by state, with its step table.</w:t>
       </w:r>
     </w:p>
     <w:p>
@@ -3164,12 +3254,14 @@
           <w:rFonts w:ascii="Arial" w:hAnsi="Arial" w:cs="Arial"/>
         </w:rPr>
       </w:pPr>
+      <w:proofErr w:type="gramStart"/>
       <w:r>
         <w:rPr>
           <w:rFonts w:ascii="Arial" w:hAnsi="Arial" w:cs="Arial"/>
         </w:rPr>
         <w:t>4  Testing</w:t>
       </w:r>
+      <w:proofErr w:type="gramEnd"/>
     </w:p>
     <w:p>
       <w:pPr>
@@ -3181,7 +3273,7 @@
         <w:rPr>
           <w:rFonts w:ascii="Arial" w:hAnsi="Arial" w:cs="Arial"/>
         </w:rPr>
-        <w:t xml:space="preserve">Each test was run in the deployed application by uploading the sample file, and the actual results come from the application. The sample files are in the samples folder of the source code. In addition, 34 automated unit tests (run with "npm test") cover every term, whole-word matching, capitalization, phrases across extra spaces and line breaks, the trace function, file validation, and a 1 MB file that scans in under one second.</w:t>
+        <w:t xml:space="preserve">Each test was run in the deployed application by uploading the sample file, and the actual results come from the application. The sample files are in the samples folder of the source code. In addition, 40 automated unit tests (run with "npm test") cover every term, whole-word matching, capitalization, phrases across extra spaces and line breaks, the trace function, file validation, and a 1 MB file that scans in under one second.</w:t>
       </w:r>
     </w:p>
     <w:tbl>
@@ -3998,8 +4090,8 @@
       <w:r>
         <w:drawing>
           <wp:inline distT="0" distB="0" distL="0" distR="0">
-            <wp:extent cx="3291840" cy="3791601"/>
-            <wp:docPr id="507" name="3-repeated-mixed-case.png" descr="3-repeated-mixed-case.png"/>
+            <wp:extent cx="4023360" cy="4901184"/>
+            <wp:docPr id="508" name="3-repeated-mixed-case.png" descr="3-repeated-mixed-case.png"/>
             <wp:cNvGraphicFramePr>
               <a:graphicFrameLocks xmlns:a="http://schemas.openxmlformats.org/drawingml/2006/main" noChangeAspect="1"/>
             </wp:cNvGraphicFramePr>
@@ -4007,11 +4099,11 @@
               <a:graphicData uri="http://schemas.openxmlformats.org/drawingml/2006/picture">
                 <pic:pic xmlns:pic="http://schemas.openxmlformats.org/drawingml/2006/picture">
                   <pic:nvPicPr>
-                    <pic:cNvPr id="507" name="3-repeated-mixed-case.png"/>
+                    <pic:cNvPr id="508" name="3-repeated-mixed-case.png"/>
                     <pic:cNvPicPr/>
                   </pic:nvPicPr>
                   <pic:blipFill>
-                    <a:blip r:embed="rId108"/>
+                    <a:blip r:embed="rId110"/>
                     <a:stretch>
                       <a:fillRect/>
                     </a:stretch>
@@ -4019,7 +4111,7 @@
                   <pic:spPr>
                     <a:xfrm>
                       <a:off x="0" y="0"/>
-                      <a:ext cx="3291840" cy="3791601"/>
+                      <a:ext cx="4023360" cy="4901184"/>
                     </a:xfrm>
                     <a:prstGeom prst="rect">
                       <a:avLst/>
@@ -4048,7 +4140,7 @@
           <w:sz w:val="18"/>
           <w:szCs w:val="18"/>
         </w:rPr>
-        <w:t xml:space="preserve">Figure 7. Test 2: the same term in different capitalization is counted together.</w:t>
+        <w:t xml:space="preserve">Figure 8. Test 2: the same term in different capitalization is counted together.</w:t>
       </w:r>
     </w:p>
     <w:p>
@@ -4061,7 +4153,7 @@
         <w:drawing>
           <wp:inline distT="0" distB="0" distL="0" distR="0">
             <wp:extent cx="4206240" cy="2753175"/>
-            <wp:docPr id="508" name="5-empty-file.png" descr="5-empty-file.png"/>
+            <wp:docPr id="509" name="5-empty-file.png" descr="5-empty-file.png"/>
             <wp:cNvGraphicFramePr>
               <a:graphicFrameLocks xmlns:a="http://schemas.openxmlformats.org/drawingml/2006/main" noChangeAspect="1"/>
             </wp:cNvGraphicFramePr>
@@ -4069,11 +4161,11 @@
               <a:graphicData uri="http://schemas.openxmlformats.org/drawingml/2006/picture">
                 <pic:pic xmlns:pic="http://schemas.openxmlformats.org/drawingml/2006/picture">
                   <pic:nvPicPr>
-                    <pic:cNvPr id="508" name="5-empty-file.png"/>
+                    <pic:cNvPr id="509" name="5-empty-file.png"/>
                     <pic:cNvPicPr/>
                   </pic:nvPicPr>
                   <pic:blipFill>
-                    <a:blip r:embed="rId109"/>
+                    <a:blip r:embed="rId111"/>
                     <a:stretch>
                       <a:fillRect/>
                     </a:stretch>
@@ -4110,7 +4202,7 @@
           <w:sz w:val="18"/>
           <w:szCs w:val="18"/>
         </w:rPr>
-        <w:t xml:space="preserve">Figure 8. Test 4: message for an empty file.</w:t>
+        <w:t xml:space="preserve">Figure 9. Test 4: message for an empty file.</w:t>
       </w:r>
     </w:p>
     <w:p>
@@ -4123,7 +4215,7 @@
         <w:drawing>
           <wp:inline distT="0" distB="0" distL="0" distR="0">
             <wp:extent cx="4206240" cy="2753175"/>
-            <wp:docPr id="509" name="6-unsupported.png" descr="6-unsupported.png"/>
+            <wp:docPr id="510" name="6-unsupported.png" descr="6-unsupported.png"/>
             <wp:cNvGraphicFramePr>
               <a:graphicFrameLocks xmlns:a="http://schemas.openxmlformats.org/drawingml/2006/main" noChangeAspect="1"/>
             </wp:cNvGraphicFramePr>
@@ -4131,11 +4223,11 @@
               <a:graphicData uri="http://schemas.openxmlformats.org/drawingml/2006/picture">
                 <pic:pic xmlns:pic="http://schemas.openxmlformats.org/drawingml/2006/picture">
                   <pic:nvPicPr>
-                    <pic:cNvPr id="509" name="6-unsupported.png"/>
+                    <pic:cNvPr id="510" name="6-unsupported.png"/>
                     <pic:cNvPicPr/>
                   </pic:nvPicPr>
                   <pic:blipFill>
-                    <a:blip r:embed="rId110"/>
+                    <a:blip r:embed="rId112"/>
                     <a:stretch>
                       <a:fillRect/>
                     </a:stretch>
@@ -4172,7 +4264,7 @@
           <w:sz w:val="18"/>
           <w:szCs w:val="18"/>
         </w:rPr>
-        <w:t xml:space="preserve">Figure 9. Test 5: message for an unsupported file format.</w:t>
+        <w:t xml:space="preserve">Figure 10. Test 5: message for an unsupported file format.</w:t>
       </w:r>
     </w:p>
     <w:p>
@@ -4182,12 +4274,14 @@
           <w:rFonts w:ascii="Arial" w:hAnsi="Arial" w:cs="Arial"/>
         </w:rPr>
       </w:pPr>
+      <w:proofErr w:type="gramStart"/>
       <w:r>
         <w:rPr>
           <w:rFonts w:ascii="Arial" w:hAnsi="Arial" w:cs="Arial"/>
         </w:rPr>
         <w:t>5  Conclusion</w:t>
       </w:r>
+      <w:proofErr w:type="gramEnd"/>
     </w:p>
     <w:p>
       <w:pPr>
@@ -4209,11 +4303,19 @@
           <w:rFonts w:ascii="Arial" w:hAnsi="Arial" w:cs="Arial"/>
         </w:rPr>
       </w:pPr>
+      <w:proofErr w:type="gramStart"/>
       <w:r>
         <w:rPr>
           <w:rFonts w:ascii="Arial" w:hAnsi="Arial" w:cs="Arial"/>
         </w:rPr>
-        <w:t>6  Sources and contributions</w:t>
+        <w:t>6  Sources</w:t>
+      </w:r>
+      <w:proofErr w:type="gramEnd"/>
+      <w:r>
+        <w:rPr>
+          <w:rFonts w:ascii="Arial" w:hAnsi="Arial" w:cs="Arial"/>
+        </w:rPr>
+        <w:t xml:space="preserve"> and contributions</w:t>
       </w:r>
     </w:p>
     <w:p>
@@ -4931,13 +5033,41 @@
         <w:szCs w:val="20"/>
       </w:rPr>
     </w:pPr>
+    <w:proofErr w:type="spellStart"/>
     <w:r>
       <w:rPr>
         <w:rFonts w:ascii="Arial" w:eastAsia="SimSun" w:hAnsi="Arial" w:cs="Arial"/>
         <w:sz w:val="20"/>
         <w:szCs w:val="20"/>
       </w:rPr>
-      <w:t>Cogtong, Candijay, 6312, Bohol, Philippines</w:t>
+      <w:t>Cogtong</w:t>
+    </w:r>
+    <w:proofErr w:type="spellEnd"/>
+    <w:r>
+      <w:rPr>
+        <w:rFonts w:ascii="Arial" w:eastAsia="SimSun" w:hAnsi="Arial" w:cs="Arial"/>
+        <w:sz w:val="20"/>
+        <w:szCs w:val="20"/>
+      </w:rPr>
+      <w:t xml:space="preserve">, </w:t>
+    </w:r>
+    <w:proofErr w:type="spellStart"/>
+    <w:r>
+      <w:rPr>
+        <w:rFonts w:ascii="Arial" w:eastAsia="SimSun" w:hAnsi="Arial" w:cs="Arial"/>
+        <w:sz w:val="20"/>
+        <w:szCs w:val="20"/>
+      </w:rPr>
+      <w:t>Candijay</w:t>
+    </w:r>
+    <w:proofErr w:type="spellEnd"/>
+    <w:r>
+      <w:rPr>
+        <w:rFonts w:ascii="Arial" w:eastAsia="SimSun" w:hAnsi="Arial" w:cs="Arial"/>
+        <w:sz w:val="20"/>
+        <w:szCs w:val="20"/>
+      </w:rPr>
+      <w:t>, 6312, Bohol, Philippines</w:t>
     </w:r>
   </w:p>
   <w:p>

</xml_diff>